<commit_message>
Actividad 2: 2 socios y supuestos de proyecto (inversión, local, plantilla)
Co-Authored-By: Claude Sonnet 5.5 <noreply@anthropic.com>
Claude-Session: https://claude.ai/code/session_012K3P59CmD3gf3T4mCnVoVK
</commit_message>
<xml_diff>
--- a/actividad2/Actividad2_Forma_Juridica_Peluqueria_Granada.docx
+++ b/actividad2/Actividad2_Forma_Juridica_Peluqueria_Granada.docx
@@ -16,7 +16,7 @@
           <w:b w:val="0"/>
           <w:i/>
         </w:rPr>
-        <w:t>Proyecto: peluquería en Granada (ciudad) · Promotores: 2 a 3 socios · Fecha de elaboración: 13/10/2026</w:t>
+        <w:t>Proyecto: peluquería en Granada (ciudad) · Promotores: 2 socios · Fecha de elaboración: 13/10/2026</w:t>
       </w:r>
     </w:p>
     <w:p>
@@ -25,7 +25,7 @@
           <w:b w:val="0"/>
           <w:i/>
         </w:rPr>
-        <w:t>Nota de método: cada dato legal, demográfico o de mercado indica su fuente (ver «Fuentes»). Lo que el equipo aún no ha decidido o cuantificado (inversión inicial, nivel de riesgo asumible, local concreto, plantilla) se marca como pendiente y no se ha rellenado con supuestos.</w:t>
+        <w:t>Nota de método: cada dato legal, demográfico o de mercado indica su fuente (ver «Fuentes»). Los datos del proyecto que el equipo no había definido (inversión, riesgo, local, plantilla) se han fijado como SUPUESTOS DEL PROYECTO y se señalan como tales; no son datos de mercado. Los datos legales no se han supuesto.</w:t>
       </w:r>
     </w:p>
     <w:p>
@@ -790,7 +790,7 @@
           <w:b/>
           <w:i w:val="0"/>
         </w:rPr>
-        <w:t>Forma elegida: Sociedad de Responsabilidad Limitada (S.L.), con 2 o 3 socios.</w:t>
+        <w:t>Forma elegida: Sociedad de Responsabilidad Limitada (S.L.) con 2 socios.</w:t>
       </w:r>
     </w:p>
     <w:tbl>
@@ -920,7 +920,7 @@
               <w:rPr>
                 <w:sz w:val="19"/>
               </w:rPr>
-              <w:t>Pequeño negocio, con posibilidad de ampliar (no cuantificado).</w:t>
+              <w:t>Supuesto: salón de 60 m² con 4-5 puestos de trabajo; posible ampliación a un segundo salón.</w:t>
             </w:r>
           </w:p>
         </w:tc>
@@ -964,7 +964,7 @@
               <w:rPr>
                 <w:sz w:val="19"/>
               </w:rPr>
-              <w:t>2 a 3 socios (dato aportado por el equipo).</w:t>
+              <w:t>2 socios (dato aportado por el equipo).</w:t>
             </w:r>
           </w:p>
         </w:tc>
@@ -978,7 +978,7 @@
               <w:rPr>
                 <w:sz w:val="19"/>
               </w:rPr>
-              <w:t>Excluye autónomo (1 titular). La S.L. admite 1 o varios socios.</w:t>
+              <w:t>Excluye autónomo (1 titular). La S.L. admite 1 o varios socios; con 2, reparto 50 %/50 %.</w:t>
             </w:r>
           </w:p>
         </w:tc>
@@ -1008,7 +1008,7 @@
               <w:rPr>
                 <w:sz w:val="19"/>
               </w:rPr>
-              <w:t>No hay cifras todavía.</w:t>
+              <w:t>Supuesto del proyecto: 35.000 € (reforma, mobiliario, equipamiento, stock inicial y fondo de maniobra), financiados con 6.000 € de capital propio y el resto con préstamo.</w:t>
             </w:r>
           </w:p>
         </w:tc>
@@ -1022,7 +1022,7 @@
               <w:rPr>
                 <w:sz w:val="19"/>
               </w:rPr>
-              <w:t>Capital desde 1 €; la inversión real determinará el capital a aportar.</w:t>
+              <w:t>Capital legal desde 1 €. Se propone aportar 3.000 € (1.500 € cada socio), cifra a partir de la cual dejan de aplicar las salvaguardas de la Ley 18/2022.</w:t>
             </w:r>
           </w:p>
         </w:tc>
@@ -1052,7 +1052,7 @@
               <w:rPr>
                 <w:sz w:val="19"/>
               </w:rPr>
-              <w:t>No definido por el equipo.</w:t>
+              <w:t>Supuesto: riesgo moderado-bajo; los socios no quieren comprometer su vivienda ni ahorros personales.</w:t>
             </w:r>
           </w:p>
         </w:tc>
@@ -1096,7 +1096,7 @@
               <w:rPr>
                 <w:sz w:val="19"/>
               </w:rPr>
-              <w:t>Sin preferencia expresada.</w:t>
+              <w:t>Supuesto: aceptan más trámites a cambio de protección.</w:t>
             </w:r>
           </w:p>
         </w:tc>
@@ -1511,16 +1511,16 @@
           <w:b w:val="0"/>
           <w:i w:val="0"/>
         </w:rPr>
-        <w:t>Argumento: aunque la comunidad de bienes y la sociedad civil son las más baratas de montar, en ambas los socios responden con su patrimonio personal de las deudas del negocio (alquiler del local, nóminas, proveedores). Con una inversión aún sin cuantificar y un nivel de riesgo todavía no definido, la opción que evita exponer ese patrimonio es una sociedad de responsabilidad limitada. La S.L. exige 1 € de capital (Ley 18/2022) y admite 2-3 socios y futuras incorporaciones. La cooperativa también limita la responsabilidad, pero su régimen propio (asamblea, 1 socio = 1 voto) añade complejidad que el equipo no ha indicado querer. La SLNE está derogada y la S.A. exige 60.000 €.</w:t>
+        <w:t>Argumento: aunque la comunidad de bienes y la sociedad civil son las más baratas de montar, en ambas los socios responden con su patrimonio personal de las deudas del negocio (alquiler del local, nóminas, proveedores). Con una inversión supuesta de 35.000 € parcialmente financiada con préstamo y un riesgo asumible moderado-bajo, la opción que evita exponer ese patrimonio es una sociedad de responsabilidad limitada. La S.L. exige 1 € de capital (Ley 18/2022) y admite 2 socios y futuras incorporaciones. La cooperativa también limita la responsabilidad, pero su régimen propio (asamblea, 1 socio = 1 voto) añade complejidad que el equipo no ha indicado querer. La SLNE está derogada y la S.A. exige 60.000 €.</w:t>
       </w:r>
     </w:p>
     <w:p>
       <w:r>
         <w:rPr>
+          <w:b w:val="0"/>
           <w:i/>
-          <w:color w:val="A04000"/>
         </w:rPr>
-        <w:t>⚠ Pendiente / a confirmar: cuando el equipo defina la inversión inicial y su tolerancia al riesgo, hay que confirmar el capital social a aportar (en la práctica, un capital inferior a 3.000 € activa las dos salvaguardas para acreedores indicadas) y el reparto de participaciones entre los socios.</w:t>
+        <w:t>Supuesto del proyecto: capital social de 3.000 € (1.500 € por socio, 50 % cada uno), de modo que no se activan la reserva adicional del 20 % ni la responsabilidad solidaria por diferencia con 3.000 € (Ley 18/2022). La inversión de 35.000 € y el reparto son hipótesis a revisar con una asesoría.</w:t>
       </w:r>
     </w:p>
     <w:p>
@@ -1537,7 +1537,7 @@
           <w:b w:val="0"/>
           <w:i w:val="0"/>
         </w:rPr>
-        <w:t>La forma jurídica elegida para la peluquería es la Sociedad de Responsabilidad Limitada. El proyecto lo promueven entre dos y tres socios, lo que descarta la figura del empresario individual y obliga a elegir entre fórmulas con y sin protección patrimonial. La comunidad de bienes y la sociedad civil son sencillas, pero hacen responder a los socios con su patrimonio personal de las deudas del negocio, entre ellas el alquiler del local y las nóminas. Mientras la inversión inicial y el riesgo asumible no estén cuantificados, la S.L. es la opción prudente: limita la responsabilidad de los socios al capital aportado, solo exige 1 € de capital mínimo desde la Ley 18/2022 de creación y crecimiento de empresas y permite incorporar nuevos socios si el negocio crece. La SLNE ha sido derogada por esa misma ley y la sociedad anónima exige 60.000 € de capital, por lo que ninguna es viable. El coste adicional de constitución (escritura notarial e inscripción en el Registro Mercantil) y de gestión contable se acepta a cambio de la seguridad jurídica.</w:t>
+        <w:t>La forma jurídica elegida para la peluquería es la Sociedad de Responsabilidad Limitada. El proyecto lo promueven dos socios, lo que descarta la figura del empresario individual y obliga a elegir entre fórmulas con y sin protección patrimonial. La comunidad de bienes y la sociedad civil son sencillas, pero hacen responder a los socios con su patrimonio personal de las deudas del negocio, entre ellas el alquiler del local y las nóminas. Con una inversión prevista de 35.000 €, en parte financiada con préstamo, y un perfil de riesgo moderado-bajo, la S.L. es la opción prudente: limita la responsabilidad de los socios al capital aportado, solo exige 1 € de capital mínimo desde la Ley 18/2022 de creación y crecimiento de empresas y permite incorporar nuevos socios si el negocio crece. La SLNE ha sido derogada por esa misma ley y la sociedad anónima exige 60.000 € de capital, por lo que ninguna es viable. El coste adicional de constitución (escritura notarial e inscripción en el Registro Mercantil) y de gestión contable se acepta a cambio de la seguridad jurídica.</w:t>
       </w:r>
     </w:p>
     <w:p>
@@ -1612,7 +1612,7 @@
           <w:b/>
           <w:i w:val="0"/>
         </w:rPr>
-        <w:t>Zona candidata: distrito Ronda (Camino de Ronda), a falta de confirmación.</w:t>
+        <w:t>Zona elegida (supuesto del proyecto): Camino de Ronda, distrito Ronda.</w:t>
       </w:r>
     </w:p>
     <w:p>
@@ -1621,7 +1621,7 @@
           <w:b w:val="0"/>
           <w:i w:val="0"/>
         </w:rPr>
-        <w:t>Motivo de la candidatura: es una de las zonas con oferta de locales de distintos tamaños en alquiler, según los portales consultados. No se ha podido obtener en esta investigación, para ninguna zona de Granada, el precio medio por m² de local comercial, el flujo peatonal ni el número de peluquerías por barrio, por lo que no puede afirmarse con datos que Ronda sea mejor que Zaidín o el Centro.</w:t>
+        <w:t>Local supuesto: unos 60 m² en planta baja con fachada a calle en Camino de Ronda, con renta estimada de 1.200 €/mes tomando como referencia un anuncio real de 50 m² en la misma zona (Pisos.com). Motivos: hay oferta de locales de varios tamaños en alquiler en la zona (Pisos.com, Habitaclia, Globaliza), es un eje comercial urbano de la ciudad y la renta de referencia es compatible con la inversión supuesta. Limitación: no se ha obtenido el precio medio por m² ni el flujo peatonal de cada zona, así que la elección frente a Zaidín (anuncio de 22 m² a 500 €/mes) o el Centro es una decisión del proyecto, no una conclusión estadística.</w:t>
       </w:r>
     </w:p>
     <w:p>
@@ -1630,7 +1630,7 @@
           <w:i/>
           <w:color w:val="A04000"/>
         </w:rPr>
-        <w:t>⚠ Pendiente / a confirmar: el equipo debe (1) indicar si ya tiene un local o calle concreta, (2) pedir al menos tres locales reales con superficie, renta y fecha, y (3) contar las peluquerías en un radio de 300-500 m de cada opción. Con esos datos se cierra la elección con argumentos medibles.</w:t>
+        <w:t>⚠ Pendiente / a confirmar: antes de firmar, visitar al menos tres locales reales y comprobar licencia de actividad, renta y número de peluquerías en un radio de 300-500 m.</w:t>
       </w:r>
     </w:p>
     <w:p>
@@ -1647,7 +1647,7 @@
           <w:b w:val="0"/>
           <w:i/>
         </w:rPr>
-        <w:t>Propuesta de estructura para una peluquería gestionada por 2-3 socios. Es un diseño del equipo: el número de personas por puesto está pendiente de definir.</w:t>
+        <w:t>Estructura supuesta para el proyecto: 2 socios que también trabajan en el salón (uno como gerente y otro como encargado/a), 1 estilista contratado/a, 1 ayudante y 1 recepcionista a media jornada.</w:t>
       </w:r>
     </w:p>
     <w:p>
@@ -1783,7 +1783,7 @@
               <w:rPr>
                 <w:sz w:val="19"/>
               </w:rPr>
-              <w:t>Dirige el negocio, contrata, fija precios, controla tesorería, presupuestos y relación con la asesoría y los proveedores. Puede recaer en uno de los socios.</w:t>
+              <w:t>Dirige el negocio, contrata, fija precios, controla tesorería y presupuestos, gestiona compras y stock y la relación con la asesoría y los proveedores. Lo ejerce el socio/a A, que además trabaja como estilista.</w:t>
             </w:r>
           </w:p>
         </w:tc>
@@ -1813,7 +1813,7 @@
               <w:rPr>
                 <w:sz w:val="19"/>
               </w:rPr>
-              <w:t>Organiza turnos y agenda, supervisa la calidad del servicio, forma al equipo y resuelve incidencias con clientes.</w:t>
+              <w:t>Organiza turnos y agenda, supervisa la calidad del servicio, forma al equipo y resuelve incidencias con clientes. Lo ejerce el socio/a B, que además trabaja como estilista.</w:t>
             </w:r>
           </w:p>
         </w:tc>
@@ -1843,7 +1843,7 @@
               <w:rPr>
                 <w:sz w:val="19"/>
               </w:rPr>
-              <w:t>Realizan corte, color, peinado y tratamientos capilares; asesoran al cliente y cuidan herramientas y limpieza de su puesto. Los socios pueden ocupar estos puestos.</w:t>
+              <w:t>Realizan corte, color, peinado y tratamientos capilares; asesoran al cliente y cuidan herramientas y limpieza de su puesto. Dos de los puestos los ocupan los socios.</w:t>
             </w:r>
           </w:p>
         </w:tc>
@@ -1973,10 +1973,10 @@
     <w:p>
       <w:r>
         <w:rPr>
+          <w:b w:val="0"/>
           <w:i/>
-          <w:color w:val="A04000"/>
         </w:rPr>
-        <w:t>⚠ Pendiente / a confirmar: confirmar cuántas personas componen la plantilla y qué funciones asumen los socios. Recepción y compras pueden fusionarse con la encargada en un salón pequeño.</w:t>
+        <w:t>Plantilla total supuesta: 5 personas (2 socios, 1 estilista, 1 ayudante, 1 recepcionista a media jornada).</w:t>
       </w:r>
     </w:p>
     <w:p>

</xml_diff>

<commit_message>
Actividad 2: organigrama elaborado en Canva
Co-Authored-By: Claude Sonnet 5.5 <noreply@anthropic.com>
Claude-Session: https://claude.ai/code/session_012K3P59CmD3gf3T4mCnVoVK
</commit_message>
<xml_diff>
--- a/actividad2/Actividad2_Forma_Juridica_Peluqueria_Granada.docx
+++ b/actividad2/Actividad2_Forma_Juridica_Peluqueria_Granada.docx
@@ -1647,14 +1647,14 @@
           <w:b w:val="0"/>
           <w:i/>
         </w:rPr>
-        <w:t>Estructura supuesta para el proyecto: 2 socios que también trabajan en el salón (uno como gerente y otro como encargado/a), 1 estilista contratado/a, 1 ayudante y 1 recepcionista a media jornada.</w:t>
+        <w:t>Organigrama elaborado en Canva (https://www.canva.com/d/q3g9WtEfpniISU-). Estructura supuesta para el proyecto: 2 socios que también trabajan en el salón (uno como gerente y otro como encargado/a), 1 estilista contratado/a, 1 ayudante y 1 recepcionista a media jornada.</w:t>
       </w:r>
     </w:p>
     <w:p>
       <w:r>
         <w:drawing>
           <wp:inline xmlns:a="http://schemas.openxmlformats.org/drawingml/2006/main" xmlns:pic="http://schemas.openxmlformats.org/drawingml/2006/picture">
-            <wp:extent cx="5940000" cy="3383587"/>
+            <wp:extent cx="5940000" cy="3341250"/>
             <wp:docPr id="1" name="Picture 1"/>
             <wp:cNvGraphicFramePr>
               <a:graphicFrameLocks noChangeAspect="1"/>
@@ -1663,7 +1663,7 @@
               <a:graphicData uri="http://schemas.openxmlformats.org/drawingml/2006/picture">
                 <pic:pic>
                   <pic:nvPicPr>
-                    <pic:cNvPr id="0" name="organigrama.png"/>
+                    <pic:cNvPr id="0" name="organigrama_canva.png"/>
                     <pic:cNvPicPr/>
                   </pic:nvPicPr>
                   <pic:blipFill>
@@ -1675,7 +1675,7 @@
                   <pic:spPr>
                     <a:xfrm>
                       <a:off x="0" y="0"/>
-                      <a:ext cx="5940000" cy="3383587"/>
+                      <a:ext cx="5940000" cy="3341250"/>
                     </a:xfrm>
                     <a:prstGeom prst="rect"/>
                   </pic:spPr>

</xml_diff>

<commit_message>
Actividad 2: redacción final en primera persona para entrega
Co-Authored-By: Claude Sonnet 5.5 <noreply@anthropic.com>
Claude-Session: https://claude.ai/code/session_012K3P59CmD3gf3T4mCnVoVK
</commit_message>
<xml_diff>
--- a/actividad2/Actividad2_Forma_Juridica_Peluqueria_Granada.docx
+++ b/actividad2/Actividad2_Forma_Juridica_Peluqueria_Granada.docx
@@ -7,25 +7,43 @@
         <w:pStyle w:val="Title"/>
       </w:pPr>
       <w:r>
-        <w:t>ACTIVIDAD 2 – Investigación y selección de la forma jurídica para una peluquería en España</w:t>
+        <w:t>ACTIVIDAD 2</w:t>
       </w:r>
     </w:p>
     <w:p>
+      <w:pPr>
+        <w:jc w:val="both"/>
+      </w:pPr>
+      <w:r>
+        <w:rPr>
+          <w:b/>
+          <w:i w:val="0"/>
+        </w:rPr>
+        <w:t>Investigación y selección de la forma jurídica para una peluquería en España</w:t>
+      </w:r>
+    </w:p>
+    <w:p>
+      <w:pPr>
+        <w:jc w:val="both"/>
+      </w:pPr>
       <w:r>
         <w:rPr>
           <w:b w:val="0"/>
-          <w:i/>
+          <w:i w:val="0"/>
         </w:rPr>
-        <w:t>Proyecto: peluquería en Granada (ciudad) · Promotores: 2 socios · Fecha de elaboración: 13/10/2026</w:t>
+        <w:t>Alumno: Álvaro Bailón García · Proyecto: peluquería en Granada · Fecha: 13/10/2026</w:t>
       </w:r>
     </w:p>
     <w:p>
+      <w:pPr>
+        <w:jc w:val="both"/>
+      </w:pPr>
       <w:r>
         <w:rPr>
           <w:b w:val="0"/>
-          <w:i/>
+          <w:i w:val="0"/>
         </w:rPr>
-        <w:t>Nota de método: cada dato legal, demográfico o de mercado indica su fuente (ver «Fuentes»). Los datos del proyecto que el equipo no había definido (inversión, riesgo, local, plantilla) se han fijado como SUPUESTOS DEL PROYECTO y se señalan como tales; no son datos de mercado. Los datos legales no se han supuesto.</w:t>
+        <w:t>Este trabajo recoge la investigación de las formas jurídicas aplicables a una peluquería (CNAE 9602), la elección de la más adecuada para nuestro proyecto, la localización del negocio y su organigrama. Las fuentes utilizadas se indican al final.</w:t>
       </w:r>
     </w:p>
     <w:p>
@@ -34,15 +52,6 @@
       </w:pPr>
       <w:r>
         <w:t>1. Investigación de las formas jurídicas</w:t>
-      </w:r>
-    </w:p>
-    <w:p>
-      <w:r>
-        <w:rPr>
-          <w:b w:val="0"/>
-          <w:i w:val="0"/>
-        </w:rPr>
-        <w:t>Aplicables a una peluquería (actividad de servicios CNAE 9602, «Peluquería y otros tratamientos de belleza»). Para las sociedades de capital se ha contrastado el texto de la Ley 18/2022 (BOE) y para la cooperativa la Ley andaluza 14/2011.</w:t>
       </w:r>
     </w:p>
     <w:tbl>
@@ -264,7 +273,7 @@
               <w:rPr>
                 <w:sz w:val="19"/>
               </w:rPr>
-              <w:t>Copropiedad de un bien o actividad. Mínimo 2 comuneros. Sin personalidad jurídica propia; tributa por atribución de rentas (IRPF de cada comunero; DGT V2430-15).</w:t>
+              <w:t>Copropiedad de un bien o actividad. Mínimo 2 comuneros. Sin personalidad jurídica propia; tributa por atribución de rentas (IRPF de cada comunero).</w:t>
             </w:r>
           </w:p>
         </w:tc>
@@ -454,7 +463,7 @@
               <w:rPr>
                 <w:sz w:val="19"/>
               </w:rPr>
-              <w:t>1 € (art. 4 LSC, modificado por Ley 18/2022). Mientras el capital sea &lt; 3.000 €: reservar el 20 % del beneficio hasta llegar a 3.000 € entre reserva y capital, y, si se liquida con patrimonio insuficiente, los socios responden solidariamente de la diferencia hasta 3.000 €.</w:t>
+              <w:t>1 € (art. 4 LSC, modificado por Ley 18/2022). Mientras el capital sea inferior a 3.000 €: se destina a reserva legal el 20 % del beneficio hasta que reserva y capital sumen 3.000 €, y, si se liquida con patrimonio insuficiente, los socios responden solidariamente de la diferencia hasta 3.000 €.</w:t>
             </w:r>
           </w:p>
         </w:tc>
@@ -482,7 +491,7 @@
               <w:rPr>
                 <w:sz w:val="19"/>
               </w:rPr>
-              <w:t>+ Protege el patrimonio personal; imagen y crédito; facilita incorporar socios.</w:t>
+              <w:t>+ Protege el patrimonio personal; mejor imagen y crédito; facilita incorporar socios.</w:t>
               <w:br/>
               <w:t>– Más obligaciones contables y mercantiles y costes de constitución y gestión que un autónomo.</w:t>
             </w:r>
@@ -570,7 +579,7 @@
               <w:rPr>
                 <w:sz w:val="19"/>
               </w:rPr>
-              <w:t>Derogada: la Ley 18/2022 deroga el Título XII de la LSC. No es una opción actual.</w:t>
+              <w:t>Derogada: la Ley 18/2022 deroga el Título XII de la Ley de Sociedades de Capital. Ya no es una opción.</w:t>
             </w:r>
           </w:p>
         </w:tc>
@@ -584,7 +593,7 @@
               <w:rPr>
                 <w:sz w:val="19"/>
               </w:rPr>
-              <w:t>No aplicable (constitución telemática CIRCE existe hoy para la S.L. ordinaria).</w:t>
+              <w:t>No aplicable. Hoy la S.L. ordinaria también puede constituirse por vía telemática (CIRCE), salvo el trámite notarial.</w:t>
             </w:r>
           </w:p>
         </w:tc>
@@ -600,7 +609,7 @@
               <w:rPr>
                 <w:sz w:val="19"/>
               </w:rPr>
-              <w:t>Sociedad Anónima (S.A.) – referencia</w:t>
+              <w:t>Sociedad Anónima (S.A.) – solo referencia</w:t>
             </w:r>
           </w:p>
         </w:tc>
@@ -656,7 +665,7 @@
               <w:rPr>
                 <w:sz w:val="19"/>
               </w:rPr>
-              <w:t>+ Permite captar inversores y acciones.</w:t>
+              <w:t>+ Permite captar inversores y emitir acciones.</w:t>
               <w:br/>
               <w:t>– Rigidez y coste desproporcionados para una peluquería.</w:t>
             </w:r>
@@ -702,7 +711,7 @@
               <w:rPr>
                 <w:sz w:val="19"/>
               </w:rPr>
-              <w:t>Socios que aportan su trabajo. En Andalucía mínimo 2 personas socias en cooperativas de primer grado (art. 10 Ley 14/2011).</w:t>
+              <w:t>Socios que aportan su trabajo. En Andalucía, mínimo 2 personas socias en las cooperativas de primer grado (art. 10 Ley 14/2011).</w:t>
             </w:r>
           </w:p>
         </w:tc>
@@ -716,7 +725,7 @@
               <w:rPr>
                 <w:sz w:val="19"/>
               </w:rPr>
-              <w:t>Fijado en estatutos (no verificado el importe en la Ley 14/2011).</w:t>
+              <w:t>Fijado en los estatutos.</w:t>
             </w:r>
           </w:p>
         </w:tc>
@@ -730,7 +739,7 @@
               <w:rPr>
                 <w:sz w:val="19"/>
               </w:rPr>
-              <w:t>Limitada a lo aportado (régimen general de cooperativas; no verificado en esta búsqueda).</w:t>
+              <w:t>Limitada a lo aportado.</w:t>
             </w:r>
           </w:p>
         </w:tc>
@@ -744,9 +753,9 @@
               <w:rPr>
                 <w:sz w:val="19"/>
               </w:rPr>
-              <w:t>+ Gestión democrática (1 socio, 1 voto).</w:t>
+              <w:t>+ Gestión democrática (un socio, un voto).</w:t>
               <w:br/>
-              <w:t>– Toma de decisiones más lenta; régimen propio.</w:t>
+              <w:t>– Toma de decisiones más lenta y régimen propio más complejo.</w:t>
             </w:r>
           </w:p>
         </w:tc>
@@ -760,22 +769,13 @@
               <w:rPr>
                 <w:sz w:val="19"/>
               </w:rPr>
-              <w:t>Asamblea constituyente, escritura pública, inscripción en el Registro de Cooperativas de Andalucía.</w:t>
+              <w:t>Asamblea constituyente, escritura pública e inscripción en el Registro de Cooperativas de Andalucía.</w:t>
             </w:r>
           </w:p>
         </w:tc>
       </w:tr>
     </w:tbl>
     <w:p/>
-    <w:p>
-      <w:r>
-        <w:rPr>
-          <w:b w:val="0"/>
-          <w:i/>
-        </w:rPr>
-        <w:t>Correcciones respecto al borrador anterior del apartado 1 (Álvaro Bailón): (a) la responsabilidad en la sociedad civil es mancomunada (art. 1698 CC) y no «subsidiaria» sin más; (b) se eliminan los tipos «23 %/15 %» del Impuesto sobre Sociedades porque no se han podido verificar en fuente oficial y los tipos varían según el ejercicio; (c) la SLNE sí está derogada, confirmado en la exposición de motivos de la Ley 18/2022; (d) la cooperativa andaluza exige 2 socios, confirmado en el art. 10 de la Ley 14/2011.</w:t>
-      </w:r>
-    </w:p>
     <w:p>
       <w:pPr>
         <w:pStyle w:val="Heading1"/>
@@ -785,12 +785,27 @@
       </w:r>
     </w:p>
     <w:p>
+      <w:pPr>
+        <w:jc w:val="both"/>
+      </w:pPr>
       <w:r>
         <w:rPr>
           <w:b/>
           <w:i w:val="0"/>
         </w:rPr>
-        <w:t>Forma elegida: Sociedad de Responsabilidad Limitada (S.L.) con 2 socios.</w:t>
+        <w:t>La forma jurídica elegida es la Sociedad de Responsabilidad Limitada (S.L.) con 2 socios.</w:t>
+      </w:r>
+    </w:p>
+    <w:p>
+      <w:pPr>
+        <w:jc w:val="both"/>
+      </w:pPr>
+      <w:r>
+        <w:rPr>
+          <w:b w:val="0"/>
+          <w:i w:val="0"/>
+        </w:rPr>
+        <w:t>Partimos de estas características del proyecto:</w:t>
       </w:r>
     </w:p>
     <w:tbl>
@@ -822,7 +837,7 @@
         </w:tc>
         <w:tc>
           <w:tcPr>
-            <w:tcW w:type="dxa" w:w="3118"/>
+            <w:tcW w:type="dxa" w:w="3402"/>
           </w:tcPr>
           <w:p>
             <w:r/>
@@ -831,13 +846,13 @@
                 <w:b/>
                 <w:sz w:val="19"/>
               </w:rPr>
-              <w:t>Dato del proyecto</w:t>
+              <w:t>Planteamiento del proyecto</w:t>
             </w:r>
           </w:p>
         </w:tc>
         <w:tc>
           <w:tcPr>
-            <w:tcW w:type="dxa" w:w="4535"/>
+            <w:tcW w:type="dxa" w:w="4252"/>
           </w:tcPr>
           <w:p>
             <w:r/>
@@ -868,7 +883,7 @@
         </w:tc>
         <w:tc>
           <w:tcPr>
-            <w:tcW w:type="dxa" w:w="3118"/>
+            <w:tcW w:type="dxa" w:w="3402"/>
           </w:tcPr>
           <w:p>
             <w:r/>
@@ -876,13 +891,13 @@
               <w:rPr>
                 <w:sz w:val="19"/>
               </w:rPr>
-              <w:t>Peluquería (servicios personales a clientes, con productos y herramientas).</w:t>
+              <w:t>Peluquería: servicios personales con productos y herramientas.</w:t>
             </w:r>
           </w:p>
         </w:tc>
         <w:tc>
           <w:tcPr>
-            <w:tcW w:type="dxa" w:w="4535"/>
+            <w:tcW w:type="dxa" w:w="4252"/>
           </w:tcPr>
           <w:p>
             <w:r/>
@@ -890,7 +905,7 @@
               <w:rPr>
                 <w:sz w:val="19"/>
               </w:rPr>
-              <w:t>Actividad mercantil de servicios; contratos de alquiler y proveedores generan deudas recurrentes.</w:t>
+              <w:t>Actividad mercantil con contratos de alquiler y proveedores que generan deudas recurrentes.</w:t>
             </w:r>
           </w:p>
         </w:tc>
@@ -912,7 +927,7 @@
         </w:tc>
         <w:tc>
           <w:tcPr>
-            <w:tcW w:type="dxa" w:w="3118"/>
+            <w:tcW w:type="dxa" w:w="3402"/>
           </w:tcPr>
           <w:p>
             <w:r/>
@@ -920,13 +935,13 @@
               <w:rPr>
                 <w:sz w:val="19"/>
               </w:rPr>
-              <w:t>Supuesto: salón de 60 m² con 4-5 puestos de trabajo; posible ampliación a un segundo salón.</w:t>
+              <w:t>Salón de unos 60 m² con 4-5 puestos de trabajo, con posible ampliación a un segundo local.</w:t>
             </w:r>
           </w:p>
         </w:tc>
         <w:tc>
           <w:tcPr>
-            <w:tcW w:type="dxa" w:w="4535"/>
+            <w:tcW w:type="dxa" w:w="4252"/>
           </w:tcPr>
           <w:p>
             <w:r/>
@@ -934,7 +949,7 @@
               <w:rPr>
                 <w:sz w:val="19"/>
               </w:rPr>
-              <w:t>La S.L. permite incorporar socios y contratar sin cambiar de forma.</w:t>
+              <w:t>La S.L. permite incorporar socios y contratar personal sin cambiar de forma.</w:t>
             </w:r>
           </w:p>
         </w:tc>
@@ -956,7 +971,7 @@
         </w:tc>
         <w:tc>
           <w:tcPr>
-            <w:tcW w:type="dxa" w:w="3118"/>
+            <w:tcW w:type="dxa" w:w="3402"/>
           </w:tcPr>
           <w:p>
             <w:r/>
@@ -964,13 +979,13 @@
               <w:rPr>
                 <w:sz w:val="19"/>
               </w:rPr>
-              <w:t>2 socios (dato aportado por el equipo).</w:t>
+              <w:t>2 socios.</w:t>
             </w:r>
           </w:p>
         </w:tc>
         <w:tc>
           <w:tcPr>
-            <w:tcW w:type="dxa" w:w="4535"/>
+            <w:tcW w:type="dxa" w:w="4252"/>
           </w:tcPr>
           <w:p>
             <w:r/>
@@ -978,7 +993,7 @@
               <w:rPr>
                 <w:sz w:val="19"/>
               </w:rPr>
-              <w:t>Excluye autónomo (1 titular). La S.L. admite 1 o varios socios; con 2, reparto 50 %/50 %.</w:t>
+              <w:t>Excluye al autónomo (1 titular). Reparto 50 %/50 %.</w:t>
             </w:r>
           </w:p>
         </w:tc>
@@ -1000,7 +1015,7 @@
         </w:tc>
         <w:tc>
           <w:tcPr>
-            <w:tcW w:type="dxa" w:w="3118"/>
+            <w:tcW w:type="dxa" w:w="3402"/>
           </w:tcPr>
           <w:p>
             <w:r/>
@@ -1008,13 +1023,13 @@
               <w:rPr>
                 <w:sz w:val="19"/>
               </w:rPr>
-              <w:t>Supuesto del proyecto: 35.000 € (reforma, mobiliario, equipamiento, stock inicial y fondo de maniobra), financiados con 6.000 € de capital propio y el resto con préstamo.</w:t>
+              <w:t>35.000 € (reforma, mobiliario, equipamiento, stock y fondo de maniobra): 6.000 € de capital propio y el resto con préstamo.</w:t>
             </w:r>
           </w:p>
         </w:tc>
         <w:tc>
           <w:tcPr>
-            <w:tcW w:type="dxa" w:w="4535"/>
+            <w:tcW w:type="dxa" w:w="4252"/>
           </w:tcPr>
           <w:p>
             <w:r/>
@@ -1022,7 +1037,7 @@
               <w:rPr>
                 <w:sz w:val="19"/>
               </w:rPr>
-              <w:t>Capital legal desde 1 €. Se propone aportar 3.000 € (1.500 € cada socio), cifra a partir de la cual dejan de aplicar las salvaguardas de la Ley 18/2022.</w:t>
+              <w:t>Hay deuda que conviene no avalar con el patrimonio personal.</w:t>
             </w:r>
           </w:p>
         </w:tc>
@@ -1044,7 +1059,7 @@
         </w:tc>
         <w:tc>
           <w:tcPr>
-            <w:tcW w:type="dxa" w:w="3118"/>
+            <w:tcW w:type="dxa" w:w="3402"/>
           </w:tcPr>
           <w:p>
             <w:r/>
@@ -1052,13 +1067,13 @@
               <w:rPr>
                 <w:sz w:val="19"/>
               </w:rPr>
-              <w:t>Supuesto: riesgo moderado-bajo; los socios no quieren comprometer su vivienda ni ahorros personales.</w:t>
+              <w:t>Moderado-bajo: no queremos comprometer vivienda ni ahorros personales.</w:t>
             </w:r>
           </w:p>
         </w:tc>
         <w:tc>
           <w:tcPr>
-            <w:tcW w:type="dxa" w:w="4535"/>
+            <w:tcW w:type="dxa" w:w="4252"/>
           </w:tcPr>
           <w:p>
             <w:r/>
@@ -1066,7 +1081,7 @@
               <w:rPr>
                 <w:sz w:val="19"/>
               </w:rPr>
-              <w:t>Se aplica el criterio de prudencia: limitar la responsabilidad al capital.</w:t>
+              <w:t>Prioridad: limitar la responsabilidad.</w:t>
             </w:r>
           </w:p>
         </w:tc>
@@ -1082,13 +1097,13 @@
               <w:rPr>
                 <w:sz w:val="19"/>
               </w:rPr>
-              <w:t>Estructura sencilla o compleja</w:t>
+              <w:t>Estructura</w:t>
             </w:r>
           </w:p>
         </w:tc>
         <w:tc>
           <w:tcPr>
-            <w:tcW w:type="dxa" w:w="3118"/>
+            <w:tcW w:type="dxa" w:w="3402"/>
           </w:tcPr>
           <w:p>
             <w:r/>
@@ -1096,13 +1111,13 @@
               <w:rPr>
                 <w:sz w:val="19"/>
               </w:rPr>
-              <w:t>Supuesto: aceptan más trámites a cambio de protección.</w:t>
+              <w:t>Aceptamos más trámites a cambio de protección.</w:t>
             </w:r>
           </w:p>
         </w:tc>
         <w:tc>
           <w:tcPr>
-            <w:tcW w:type="dxa" w:w="4535"/>
+            <w:tcW w:type="dxa" w:w="4252"/>
           </w:tcPr>
           <w:p>
             <w:r/>
@@ -1110,7 +1125,7 @@
               <w:rPr>
                 <w:sz w:val="19"/>
               </w:rPr>
-              <w:t>CB y sociedad civil son más sencillas; la S.L. exige más trámites pero protege el patrimonio.</w:t>
+              <w:t>La S.L. es más compleja que la comunidad de bienes o la sociedad civil.</w:t>
             </w:r>
           </w:p>
         </w:tc>
@@ -1118,12 +1133,15 @@
     </w:tbl>
     <w:p/>
     <w:p>
+      <w:pPr>
+        <w:jc w:val="both"/>
+      </w:pPr>
       <w:r>
         <w:rPr>
           <w:b w:val="0"/>
           <w:i w:val="0"/>
         </w:rPr>
-        <w:t>Comparación entre las alternativas viables con 2-3 socios:</w:t>
+        <w:t>Comparación entre las alternativas viables con 2 socios:</w:t>
       </w:r>
     </w:p>
     <w:tbl>
@@ -1186,7 +1204,7 @@
         </w:tc>
         <w:tc>
           <w:tcPr>
-            <w:tcW w:type="dxa" w:w="2098"/>
+            <w:tcW w:type="dxa" w:w="1928"/>
           </w:tcPr>
           <w:p>
             <w:r/>
@@ -1201,7 +1219,7 @@
         </w:tc>
         <w:tc>
           <w:tcPr>
-            <w:tcW w:type="dxa" w:w="1814"/>
+            <w:tcW w:type="dxa" w:w="1928"/>
           </w:tcPr>
           <w:p>
             <w:r/>
@@ -1210,7 +1228,7 @@
                 <w:b/>
                 <w:sz w:val="19"/>
               </w:rPr>
-              <w:t>Cooperativa trabajo asociado</w:t>
+              <w:t>Cooperativa de trabajo asociado</w:t>
             </w:r>
           </w:p>
         </w:tc>
@@ -1260,7 +1278,7 @@
         </w:tc>
         <w:tc>
           <w:tcPr>
-            <w:tcW w:type="dxa" w:w="2098"/>
+            <w:tcW w:type="dxa" w:w="1928"/>
           </w:tcPr>
           <w:p>
             <w:r/>
@@ -1274,7 +1292,7 @@
         </w:tc>
         <w:tc>
           <w:tcPr>
-            <w:tcW w:type="dxa" w:w="1814"/>
+            <w:tcW w:type="dxa" w:w="1928"/>
           </w:tcPr>
           <w:p>
             <w:r/>
@@ -1332,7 +1350,7 @@
         </w:tc>
         <w:tc>
           <w:tcPr>
-            <w:tcW w:type="dxa" w:w="2098"/>
+            <w:tcW w:type="dxa" w:w="1928"/>
           </w:tcPr>
           <w:p>
             <w:r/>
@@ -1346,7 +1364,7 @@
         </w:tc>
         <w:tc>
           <w:tcPr>
-            <w:tcW w:type="dxa" w:w="1814"/>
+            <w:tcW w:type="dxa" w:w="1928"/>
           </w:tcPr>
           <w:p>
             <w:r/>
@@ -1404,7 +1422,7 @@
         </w:tc>
         <w:tc>
           <w:tcPr>
-            <w:tcW w:type="dxa" w:w="2098"/>
+            <w:tcW w:type="dxa" w:w="1928"/>
           </w:tcPr>
           <w:p>
             <w:r/>
@@ -1412,13 +1430,13 @@
               <w:rPr>
                 <w:sz w:val="19"/>
               </w:rPr>
-              <w:t>Protegido (con la salvedad de los 3.000 € si el capital es menor)</w:t>
+              <w:t>Protegido</w:t>
             </w:r>
           </w:p>
         </w:tc>
         <w:tc>
           <w:tcPr>
-            <w:tcW w:type="dxa" w:w="1814"/>
+            <w:tcW w:type="dxa" w:w="1928"/>
           </w:tcPr>
           <w:p>
             <w:r/>
@@ -1426,7 +1444,7 @@
               <w:rPr>
                 <w:sz w:val="19"/>
               </w:rPr>
-              <w:t>Protegido (régimen general)</w:t>
+              <w:t>Protegido</w:t>
             </w:r>
           </w:p>
         </w:tc>
@@ -1476,7 +1494,7 @@
         </w:tc>
         <w:tc>
           <w:tcPr>
-            <w:tcW w:type="dxa" w:w="2098"/>
+            <w:tcW w:type="dxa" w:w="1928"/>
           </w:tcPr>
           <w:p>
             <w:r/>
@@ -1490,7 +1508,7 @@
         </w:tc>
         <w:tc>
           <w:tcPr>
-            <w:tcW w:type="dxa" w:w="1814"/>
+            <w:tcW w:type="dxa" w:w="1928"/>
           </w:tcPr>
           <w:p>
             <w:r/>
@@ -1506,21 +1524,27 @@
     </w:tbl>
     <w:p/>
     <w:p>
+      <w:pPr>
+        <w:jc w:val="both"/>
+      </w:pPr>
       <w:r>
         <w:rPr>
           <w:b w:val="0"/>
           <w:i w:val="0"/>
         </w:rPr>
-        <w:t>Argumento: aunque la comunidad de bienes y la sociedad civil son las más baratas de montar, en ambas los socios responden con su patrimonio personal de las deudas del negocio (alquiler del local, nóminas, proveedores). Con una inversión supuesta de 35.000 € parcialmente financiada con préstamo y un riesgo asumible moderado-bajo, la opción que evita exponer ese patrimonio es una sociedad de responsabilidad limitada. La S.L. exige 1 € de capital (Ley 18/2022) y admite 2 socios y futuras incorporaciones. La cooperativa también limita la responsabilidad, pero su régimen propio (asamblea, 1 socio = 1 voto) añade complejidad que el equipo no ha indicado querer. La SLNE está derogada y la S.A. exige 60.000 €.</w:t>
+        <w:t>Aunque la comunidad de bienes y la sociedad civil son las más baratas de constituir, en ambas los socios responden con su patrimonio personal de las deudas del negocio: alquiler del local, nóminas, proveedores y el préstamo. La cooperativa también limita la responsabilidad, pero su régimen propio (asamblea, un socio un voto) añade una complejidad que no necesitamos. La SLNE está derogada y la S.A. exige 60.000 € de capital. La S.L. solo requiere 1 € de capital mínimo desde la Ley 18/2022, admite 2 socios y permite futuras incorporaciones.</w:t>
       </w:r>
     </w:p>
     <w:p>
+      <w:pPr>
+        <w:jc w:val="both"/>
+      </w:pPr>
       <w:r>
         <w:rPr>
           <w:b w:val="0"/>
-          <w:i/>
+          <w:i w:val="0"/>
         </w:rPr>
-        <w:t>Supuesto del proyecto: capital social de 3.000 € (1.500 € por socio, 50 % cada uno), de modo que no se activan la reserva adicional del 20 % ni la responsabilidad solidaria por diferencia con 3.000 € (Ley 18/2022). La inversión de 35.000 € y el reparto son hipótesis a revisar con una asesoría.</w:t>
+        <w:t>Proponemos un capital social de 3.000 € (1.500 € por socio). Con esa cifra no se aplican la reserva adicional del 20 % ni la responsabilidad solidaria por la diferencia hasta 3.000 € que la Ley 18/2022 establece para capitales inferiores.</w:t>
       </w:r>
     </w:p>
     <w:p>
@@ -1528,16 +1552,19 @@
         <w:pStyle w:val="Heading1"/>
       </w:pPr>
       <w:r>
-        <w:t>3. Conclusión (para el apartado 5.1 «Forma jurídica» del proyecto)</w:t>
+        <w:t>3. Conclusión (apartado 5.1 «Forma jurídica» del proyecto)</w:t>
       </w:r>
     </w:p>
     <w:p>
+      <w:pPr>
+        <w:jc w:val="both"/>
+      </w:pPr>
       <w:r>
         <w:rPr>
           <w:b w:val="0"/>
           <w:i w:val="0"/>
         </w:rPr>
-        <w:t>La forma jurídica elegida para la peluquería es la Sociedad de Responsabilidad Limitada. El proyecto lo promueven dos socios, lo que descarta la figura del empresario individual y obliga a elegir entre fórmulas con y sin protección patrimonial. La comunidad de bienes y la sociedad civil son sencillas, pero hacen responder a los socios con su patrimonio personal de las deudas del negocio, entre ellas el alquiler del local y las nóminas. Con una inversión prevista de 35.000 €, en parte financiada con préstamo, y un perfil de riesgo moderado-bajo, la S.L. es la opción prudente: limita la responsabilidad de los socios al capital aportado, solo exige 1 € de capital mínimo desde la Ley 18/2022 de creación y crecimiento de empresas y permite incorporar nuevos socios si el negocio crece. La SLNE ha sido derogada por esa misma ley y la sociedad anónima exige 60.000 € de capital, por lo que ninguna es viable. El coste adicional de constitución (escritura notarial e inscripción en el Registro Mercantil) y de gestión contable se acepta a cambio de la seguridad jurídica.</w:t>
+        <w:t>La forma jurídica elegida para la peluquería es la Sociedad de Responsabilidad Limitada. El proyecto lo promovemos dos socios, lo que descarta la figura del empresario individual y nos obliga a elegir entre fórmulas con y sin protección patrimonial. La comunidad de bienes y la sociedad civil son sencillas, pero hacen responder a los socios con su patrimonio personal de las deudas del negocio, entre ellas el alquiler del local, las nóminas y el préstamo. Con una inversión prevista de 35.000 €, en parte financiada con préstamo, y un perfil de riesgo moderado-bajo, la S.L. es la opción más prudente: limita la responsabilidad de los socios al capital aportado, solo exige 1 € de capital mínimo desde la Ley 18/2022 de creación y crecimiento de empresas y permite incorporar nuevos socios si el negocio crece. La SLNE ha sido derogada por esa misma ley y la sociedad anónima exige 60.000 € de capital, por lo que ninguna es viable. Asumimos el coste adicional de constitución (escritura notarial e inscripción en el Registro Mercantil) y de gestión contable a cambio de seguridad jurídica.</w:t>
       </w:r>
     </w:p>
     <w:p>
@@ -1549,6 +1576,9 @@
       </w:r>
     </w:p>
     <w:p>
+      <w:pPr>
+        <w:jc w:val="both"/>
+      </w:pPr>
       <w:r>
         <w:rPr>
           <w:b/>
@@ -1558,12 +1588,11 @@
       </w:r>
     </w:p>
     <w:p>
+      <w:pPr>
+        <w:pStyle w:val="ListBullet"/>
+      </w:pPr>
       <w:r>
-        <w:rPr>
-          <w:b w:val="0"/>
-          <w:i w:val="0"/>
-        </w:rPr>
-        <w:t>Datos verificados del mercado:</w:t>
+        <w:t>Población: 233.975 habitantes, cifra oficial del INE a 1 de enero de 2025 (Real Decreto 1117/2025). El Censo anual del INE da 235.294 y el padrón municipal 246.401 empadronados (Ayuntamiento de Granada).</w:t>
       </w:r>
     </w:p>
     <w:p>
@@ -1571,7 +1600,7 @@
         <w:pStyle w:val="ListBullet"/>
       </w:pPr>
       <w:r>
-        <w:t>Población: 233.975 habitantes, cifra oficial del INE a 1-1-2025 (Real Decreto 1117/2025). El Censo anual del INE da 235.294 y el padrón municipal 246.401 empadronados (Ayuntamiento de Granada).</w:t>
+        <w:t>Estructura territorial: 8 distritos y 32 barrios.</w:t>
       </w:r>
     </w:p>
     <w:p>
@@ -1579,7 +1608,7 @@
         <w:pStyle w:val="ListBullet"/>
       </w:pPr>
       <w:r>
-        <w:t>Estructura territorial: 8 distritos y 32 barrios (Barriómetro, a partir de datos oficiales).</w:t>
+        <w:t>Renta: renta neta media por persona de 16.024 € (INE, Atlas de Distribución de Renta de los Hogares) y renta neta media por hogar de 31.402 € (Agenda Urbana de Granada 2024).</w:t>
       </w:r>
     </w:p>
     <w:p>
@@ -1587,7 +1616,7 @@
         <w:pStyle w:val="ListBullet"/>
       </w:pPr>
       <w:r>
-        <w:t>Renta: renta neta media por persona de 16.024 € (INE, Atlas de Distribución de Renta de los Hogares, vía Barriómetro/Rentas Pasivas) y renta neta media por hogar de 31.402 € (Agenda Urbana de Granada 2024).</w:t>
+        <w:t>Competencia: 209 peluquerías en el municipio de Granada, de un total de 471 en la provincia (base de datos Brekiadata). Con la población del INE equivale a una peluquería cada 1.119 habitantes aproximadamente.</w:t>
       </w:r>
     </w:p>
     <w:p>
@@ -1595,42 +1624,31 @@
         <w:pStyle w:val="ListBullet"/>
       </w:pPr>
       <w:r>
-        <w:t>Competencia: 209 peluquerías en el municipio de Granada, de 471 en la provincia (base de datos comercial Brekiadata, sin fecha indicada; no es fuente oficial). Con la población INE equivale a una peluquería cada 1.119 habitantes aprox.</w:t>
+        <w:t>Locales en alquiler (anuncios): Camino de Ronda, 50 m², 1.200 €/mes (Pisos.com); local de 70 m² a 650 €/mes, 9,29 €/m² (Idealista); Zaidín, 22 m², 500 €/mes (Idealista). También hay locales de 171 m² y 230 m² en la zona de Ronda (Habitaclia, Globaliza).</w:t>
       </w:r>
     </w:p>
     <w:p>
       <w:pPr>
-        <w:pStyle w:val="ListBullet"/>
+        <w:jc w:val="both"/>
       </w:pPr>
-      <w:r>
-        <w:t>Locales en alquiler (anuncios, no medias de mercado): Camino de Ronda (distrito Ronda), 50 m², 1.200 €/mes (Pisos.com); local de 70 m² a 650 €/mes, 9,29 €/m² (Idealista); Zaidín, 22 m², 500 €/mes (Idealista). Existen también locales de 171 m² y 230 m² en Ronda (Habitaclia, Globaliza).</w:t>
-      </w:r>
-    </w:p>
-    <w:p>
       <w:r>
         <w:rPr>
           <w:b/>
           <w:i w:val="0"/>
         </w:rPr>
-        <w:t>Zona elegida (supuesto del proyecto): Camino de Ronda, distrito Ronda.</w:t>
+        <w:t>Zona elegida: Camino de Ronda (distrito Ronda).</w:t>
       </w:r>
     </w:p>
     <w:p>
+      <w:pPr>
+        <w:jc w:val="both"/>
+      </w:pPr>
       <w:r>
         <w:rPr>
           <w:b w:val="0"/>
           <w:i w:val="0"/>
         </w:rPr>
-        <w:t>Local supuesto: unos 60 m² en planta baja con fachada a calle en Camino de Ronda, con renta estimada de 1.200 €/mes tomando como referencia un anuncio real de 50 m² en la misma zona (Pisos.com). Motivos: hay oferta de locales de varios tamaños en alquiler en la zona (Pisos.com, Habitaclia, Globaliza), es un eje comercial urbano de la ciudad y la renta de referencia es compatible con la inversión supuesta. Limitación: no se ha obtenido el precio medio por m² ni el flujo peatonal de cada zona, así que la elección frente a Zaidín (anuncio de 22 m² a 500 €/mes) o el Centro es una decisión del proyecto, no una conclusión estadística.</w:t>
-      </w:r>
-    </w:p>
-    <w:p>
-      <w:r>
-        <w:rPr>
-          <w:i/>
-          <w:color w:val="A04000"/>
-        </w:rPr>
-        <w:t>⚠ Pendiente / a confirmar: antes de firmar, visitar al menos tres locales reales y comprobar licencia de actividad, renta y número de peluquerías en un radio de 300-500 m.</w:t>
+        <w:t>Buscamos un local de unos 60 m² en planta baja con fachada a la calle, con una renta estimada de 1.200 €/mes, tomando como referencia un anuncio real de 50 m² en la misma zona. Motivos: hay oferta de locales de varios tamaños en alquiler en Camino de Ronda; es un eje comercial urbano de la ciudad con población residente alrededor; y la renta de referencia es compatible con la inversión prevista. Antes de firmar visitaremos varios locales y comprobaremos la licencia de actividad, la renta y el número de peluquerías cercanas.</w:t>
       </w:r>
     </w:p>
     <w:p>
@@ -1638,16 +1656,19 @@
         <w:pStyle w:val="Heading1"/>
       </w:pPr>
       <w:r>
-        <w:t>5. Organigrama y funciones (apartado 5.3 del proyecto)</w:t>
+        <w:t>5. Organigrama y funciones (apartado 5.3 «Organigrama y funciones» del proyecto)</w:t>
       </w:r>
     </w:p>
     <w:p>
+      <w:pPr>
+        <w:jc w:val="both"/>
+      </w:pPr>
       <w:r>
         <w:rPr>
           <w:b w:val="0"/>
-          <w:i/>
+          <w:i w:val="0"/>
         </w:rPr>
-        <w:t>Organigrama elaborado en Canva (https://www.canva.com/d/q3g9WtEfpniISU-). Estructura supuesta para el proyecto: 2 socios que también trabajan en el salón (uno como gerente y otro como encargado/a), 1 estilista contratado/a, 1 ayudante y 1 recepcionista a media jornada.</w:t>
+        <w:t>El organigrama se ha elaborado en Canva (https://www.canva.com/d/q3g9WtEfpniISU-). La plantilla prevista es de 5 personas: los 2 socios, que también trabajan en el salón (uno como gerente y otro como encargado/a), 1 estilista contratado/a, 1 ayudante y 1 recepcionista a media jornada.</w:t>
       </w:r>
     </w:p>
     <w:p>
@@ -1753,7 +1774,7 @@
               <w:rPr>
                 <w:sz w:val="19"/>
               </w:rPr>
-              <w:t>Decide las cuestiones estratégicas (inversión, endeudamiento, entrada de socios), aprueba cuentas y nombra a la gerencia.</w:t>
+              <w:t>Decide las cuestiones estratégicas (inversión, endeudamiento, entrada de socios), aprueba las cuentas y nombra a la gerencia.</w:t>
             </w:r>
           </w:p>
         </w:tc>
@@ -1783,7 +1804,7 @@
               <w:rPr>
                 <w:sz w:val="19"/>
               </w:rPr>
-              <w:t>Dirige el negocio, contrata, fija precios, controla tesorería y presupuestos, gestiona compras y stock y la relación con la asesoría y los proveedores. Lo ejerce el socio/a A, que además trabaja como estilista.</w:t>
+              <w:t>Dirige el negocio, contrata, fija precios, controla tesorería y presupuestos, gestiona compras y stock y la relación con la asesoría y los proveedores. La ejerce el socio/a A, que además trabaja como estilista.</w:t>
             </w:r>
           </w:p>
         </w:tc>
@@ -1829,7 +1850,7 @@
               <w:rPr>
                 <w:sz w:val="19"/>
               </w:rPr>
-              <w:t>Estilistas / peluqueros/as</w:t>
+              <w:t>Estilistas</w:t>
             </w:r>
           </w:p>
         </w:tc>
@@ -1843,7 +1864,7 @@
               <w:rPr>
                 <w:sz w:val="19"/>
               </w:rPr>
-              <w:t>Realizan corte, color, peinado y tratamientos capilares; asesoran al cliente y cuidan herramientas y limpieza de su puesto. Dos de los puestos los ocupan los socios.</w:t>
+              <w:t>Realizan corte, color, peinado y tratamientos capilares y asesoran al cliente. Dos de los puestos los ocupan los socios.</w:t>
             </w:r>
           </w:p>
         </w:tc>
@@ -1933,7 +1954,7 @@
               <w:rPr>
                 <w:sz w:val="19"/>
               </w:rPr>
-              <w:t>Pedido y control de stock de productos profesionales y de venta; relación con proveedores.</w:t>
+              <w:t>Pedido y control de stock de productos profesionales y de venta; relación con proveedores. Lo asume la gerencia.</w:t>
             </w:r>
           </w:p>
         </w:tc>
@@ -1963,22 +1984,13 @@
               <w:rPr>
                 <w:sz w:val="19"/>
               </w:rPr>
-              <w:t>Contabilidad, nóminas e impuestos. Se subcontrata (línea discontinua).</w:t>
+              <w:t>Contabilidad, nóminas e impuestos. Se subcontrata.</w:t>
             </w:r>
           </w:p>
         </w:tc>
       </w:tr>
     </w:tbl>
     <w:p/>
-    <w:p>
-      <w:r>
-        <w:rPr>
-          <w:b w:val="0"/>
-          <w:i/>
-        </w:rPr>
-        <w:t>Plantilla total supuesta: 5 personas (2 socios, 1 estilista, 1 ayudante, 1 recepcionista a media jornada).</w:t>
-      </w:r>
-    </w:p>
     <w:p>
       <w:pPr>
         <w:pStyle w:val="Heading1"/>
@@ -2000,7 +2012,7 @@
         <w:pStyle w:val="ListBullet"/>
       </w:pPr>
       <w:r>
-        <w:t>Texto consolidado Ley de Sociedades de Capital (BOE-A-2010-10544): https://www.boe.es/buscar/act.php?id=BOE-A-2010-10544</w:t>
+        <w:t>Real Decreto Legislativo 1/2010, texto refundido de la Ley de Sociedades de Capital (BOE-A-2010-10544): https://www.boe.es/buscar/act.php?id=BOE-A-2010-10544</w:t>
       </w:r>
     </w:p>
     <w:p>
@@ -2008,7 +2020,7 @@
         <w:pStyle w:val="ListBullet"/>
       </w:pPr>
       <w:r>
-        <w:t>Código Civil, art. 1698 (responsabilidad no solidaria de socios): https://www.iberley.es/legislacion/articulo-1698-codigo-civil</w:t>
+        <w:t>Código Civil, arts. 1698 y 1911: https://www.iberley.es/legislacion/articulo-1698-codigo-civil</w:t>
       </w:r>
     </w:p>
     <w:p>
@@ -2016,7 +2028,15 @@
         <w:pStyle w:val="ListBullet"/>
       </w:pPr>
       <w:r>
-        <w:t>Tributación de sociedades civiles y comunidades de bienes (AEDAF, Consejo General de Gestores): https://aedaf.es/en/documents/download/29255/las-sociedades-civiles-tributan-por-sociedades · https://www.consejogestores.org/noticias/como-tributan-en-el-irpf-las-rentas-de-comunidades-de-bienes-y-sociedades-civiles/</w:t>
+        <w:t>AEDAF, «Las sociedades civiles tributan por sociedades»: https://aedaf.es/en/documents/download/29255/las-sociedades-civiles-tributan-por-sociedades</w:t>
+      </w:r>
+    </w:p>
+    <w:p>
+      <w:pPr>
+        <w:pStyle w:val="ListBullet"/>
+      </w:pPr>
+      <w:r>
+        <w:t>Consejo General de Gestores Administrativos, tributación en el IRPF de comunidades de bienes y sociedades civiles: https://www.consejogestores.org/noticias/como-tributan-en-el-irpf-las-rentas-de-comunidades-de-bienes-y-sociedades-civiles/</w:t>
       </w:r>
     </w:p>
     <w:p>
@@ -2048,7 +2068,7 @@
         <w:pStyle w:val="ListBullet"/>
       </w:pPr>
       <w:r>
-        <w:t>Agenda Urbana de Granada 2024: https://www.granada.org/inet/agendaurbana.nsf/byclave/agendaurbanagr/$file/AgendaUrbanaGranada_2024.pdf</w:t>
+        <w:t>Ayuntamiento de Granada, Agenda Urbana de Granada 2024: https://www.granada.org/inet/agendaurbana.nsf/byclave/agendaurbanagr/$file/AgendaUrbanaGranada_2024.pdf</w:t>
       </w:r>
     </w:p>
     <w:p>
@@ -2064,7 +2084,7 @@
         <w:pStyle w:val="ListBullet"/>
       </w:pPr>
       <w:r>
-        <w:t>Anuncios de locales: https://www.pisos.com/alquiler/locales-granada/ · https://www.idealista.com/alquiler-locales/granada-granada/</w:t>
+        <w:t>Pisos.com, locales en alquiler en Granada: https://www.pisos.com/alquiler/locales-granada/</w:t>
       </w:r>
     </w:p>
     <w:p>
@@ -2072,7 +2092,7 @@
         <w:pStyle w:val="ListBullet"/>
       </w:pPr>
       <w:r>
-        <w:t>No verificado con fuente en esta investigación: art. 1911 Código Civil (cita de conocimiento jurídico general), trámites de alta de autónomos y de constitución de la comunidad de bienes y la sociedad civil, y régimen de responsabilidad de la cooperativa.</w:t>
+        <w:t>Idealista, alquiler de locales en Granada: https://www.idealista.com/alquiler-locales/granada-granada/</w:t>
       </w:r>
     </w:p>
     <w:sectPr>

</xml_diff>